<commit_message>
checkpoint: record step 9 revision two and platform apply lesson
</commit_message>
<xml_diff>
--- a/worlds/korvin-merrow/file-review/revision/filesystem/ed_triage_initial_intake_05182026.docx
+++ b/worlds/korvin-merrow/file-review/revision/filesystem/ed_triage_initial_intake_05182026.docx
@@ -1955,7 +1955,7 @@
       <w:r>
         <w:rPr>
           <w:rFonts w:ascii="Arial" w:hAnsi="Arial"/>
-          <w:b/>
+          <w:b w:val="0"/>
           <w:i w:val="0"/>
           <w:color w:val="000000"/>
           <w:sz w:val="19"/>
@@ -2092,7 +2092,7 @@
       <w:r>
         <w:rPr>
           <w:rFonts w:ascii="Arial" w:hAnsi="Arial"/>
-          <w:b/>
+          <w:b w:val="0"/>
           <w:i w:val="0"/>
           <w:color w:val="000000"/>
           <w:sz w:val="19"/>

</xml_diff>